<commit_message>
finish Server vs WASM trade-offs, rendering, state management
</commit_message>
<xml_diff>
--- a/Interview/NewK/CompanyMain/Progress.docx
+++ b/Interview/NewK/CompanyMain/Progress.docx
@@ -1,6 +1,6 @@
 
 <file path=word/document.xml><?xml version="1.0" encoding="utf-8"?>
-<w:document xmlns:wpc="http://schemas.microsoft.com/office/word/2010/wordprocessingCanvas" xmlns:cx="http://schemas.microsoft.com/office/drawing/2014/chartex" xmlns:cx1="http://schemas.microsoft.com/office/drawing/2015/9/8/chartex" xmlns:cx2="http://schemas.microsoft.com/office/drawing/2015/10/21/chartex" xmlns:cx3="http://schemas.microsoft.com/office/drawing/2016/5/9/chartex" xmlns:cx4="http://schemas.microsoft.com/office/drawing/2016/5/10/chartex" xmlns:cx5="http://schemas.microsoft.com/office/drawing/2016/5/11/chartex" xmlns:cx6="http://schemas.microsoft.com/office/drawing/2016/5/12/chartex" xmlns:cx7="http://schemas.microsoft.com/office/drawing/2016/5/13/chartex" xmlns:cx8="http://schemas.microsoft.com/office/drawing/2016/5/14/chartex" xmlns:mc="http://schemas.openxmlformats.org/markup-compatibility/2006" xmlns:aink="http://schemas.microsoft.com/office/drawing/2016/ink" xmlns:am3d="http://schemas.microsoft.com/office/drawing/2017/model3d" xmlns:o="urn:schemas-microsoft-com:office:office" xmlns:r="http://schemas.openxmlformats.org/officeDocument/2006/relationships" xmlns:m="http://schemas.openxmlformats.org/officeDocument/2006/math" xmlns:v="urn:schemas-microsoft-com:vml" xmlns:wp14="http://schemas.microsoft.com/office/word/2010/wordprocessingDrawing" xmlns:wp="http://schemas.openxmlformats.org/drawingml/2006/wordprocessingDrawing" xmlns:w10="urn:schemas-microsoft-com:office:word" xmlns:w="http://schemas.openxmlformats.org/wordprocessingml/2006/main" xmlns:w14="http://schemas.microsoft.com/office/word/2010/wordml" xmlns:w15="http://schemas.microsoft.com/office/word/2012/wordml" xmlns:w16cid="http://schemas.microsoft.com/office/word/2016/wordml/cid" xmlns:w16se="http://schemas.microsoft.com/office/word/2015/wordml/symex" xmlns:wpg="http://schemas.microsoft.com/office/word/2010/wordprocessingGroup" xmlns:wpi="http://schemas.microsoft.com/office/word/2010/wordprocessingInk" xmlns:wne="http://schemas.microsoft.com/office/word/2006/wordml" xmlns:wps="http://schemas.microsoft.com/office/word/2010/wordprocessingShape" mc:Ignorable="w14 w15 w16se w16cid wp14">
+<w:document xmlns:wpc="http://schemas.microsoft.com/office/word/2010/wordprocessingCanvas" xmlns:cx="http://schemas.microsoft.com/office/drawing/2014/chartex" xmlns:cx1="http://schemas.microsoft.com/office/drawing/2015/9/8/chartex" xmlns:mc="http://schemas.openxmlformats.org/markup-compatibility/2006" xmlns:o="urn:schemas-microsoft-com:office:office" xmlns:r="http://schemas.openxmlformats.org/officeDocument/2006/relationships" xmlns:m="http://schemas.openxmlformats.org/officeDocument/2006/math" xmlns:v="urn:schemas-microsoft-com:vml" xmlns:wp14="http://schemas.microsoft.com/office/word/2010/wordprocessingDrawing" xmlns:wp="http://schemas.openxmlformats.org/drawingml/2006/wordprocessingDrawing" xmlns:w10="urn:schemas-microsoft-com:office:word" xmlns:w="http://schemas.openxmlformats.org/wordprocessingml/2006/main" xmlns:w14="http://schemas.microsoft.com/office/word/2010/wordml" xmlns:w15="http://schemas.microsoft.com/office/word/2012/wordml" xmlns:w16se="http://schemas.microsoft.com/office/word/2015/wordml/symex" xmlns:wpg="http://schemas.microsoft.com/office/word/2010/wordprocessingGroup" xmlns:wpi="http://schemas.microsoft.com/office/word/2010/wordprocessingInk" xmlns:wne="http://schemas.microsoft.com/office/word/2006/wordml" xmlns:wps="http://schemas.microsoft.com/office/word/2010/wordprocessingShape" mc:Ignorable="w14 w15 w16se wp14">
   <w:body>
     <w:p>
       <w:pPr>
@@ -247,13 +247,10 @@
       </w:r>
       <w:proofErr w:type="spellEnd"/>
       <w:r>
-        <w:t xml:space="preserve"> integration basic</w:t>
+        <w:t xml:space="preserve"> integration basics, API calling patterns</w:t>
       </w:r>
       <w:bookmarkStart w:id="0" w:name="_GoBack"/>
       <w:bookmarkEnd w:id="0"/>
-      <w:r>
-        <w:t>s, API calling patterns</w:t>
-      </w:r>
     </w:p>
     <w:p>
       <w:pPr>
@@ -400,7 +397,15 @@
       </w:r>
       <w:proofErr w:type="spellEnd"/>
       <w:r>
-        <w:t xml:space="preserve"> config, secrets</w:t>
+        <w:t xml:space="preserve"> </w:t>
+      </w:r>
+      <w:proofErr w:type="spellStart"/>
+      <w:r>
+        <w:t>config</w:t>
+      </w:r>
+      <w:proofErr w:type="spellEnd"/>
+      <w:r>
+        <w:t>, secrets</w:t>
       </w:r>
     </w:p>
     <w:p>
@@ -559,8 +564,13 @@
       </w:r>
       <w:proofErr w:type="spellEnd"/>
       <w:r>
-        <w:t>/idempotency</w:t>
-      </w:r>
+        <w:t>/</w:t>
+      </w:r>
+      <w:proofErr w:type="spellStart"/>
+      <w:r>
+        <w:t>idempotency</w:t>
+      </w:r>
+      <w:proofErr w:type="spellEnd"/>
     </w:p>
     <w:p>
       <w:pPr>
@@ -676,6 +686,639 @@
       </w:pPr>
       <w:r>
         <w:t>explain failure scenarios + how Outbox/Saga handles them</w:t>
+      </w:r>
+    </w:p>
+    <w:p>
+      <w:r>
+        <w:rPr>
+          <w:noProof/>
+        </w:rPr>
+        <w:pict>
+          <v:rect id="_x0000_i1025" alt="" style="width:451pt;height:.05pt;mso-width-percent:0;mso-height-percent:0;mso-width-percent:0;mso-height-percent:0" o:hralign="center" o:hrstd="t" o:hr="t" fillcolor="#a0a0a0" stroked="f"/>
+        </w:pict>
+      </w:r>
+    </w:p>
+    <w:p>
+      <w:pPr>
+        <w:pStyle w:val="Heading2"/>
+      </w:pPr>
+      <w:r>
+        <w:t xml:space="preserve">Week 2 — </w:t>
+      </w:r>
+      <w:proofErr w:type="spellStart"/>
+      <w:r>
+        <w:t>Entra</w:t>
+      </w:r>
+      <w:proofErr w:type="spellEnd"/>
+      <w:r>
+        <w:t xml:space="preserve"> SSO + AWS + DDD + Data/BI + </w:t>
+      </w:r>
+      <w:proofErr w:type="spellStart"/>
+      <w:r>
+        <w:t>Camunda</w:t>
+      </w:r>
+      <w:proofErr w:type="spellEnd"/>
+    </w:p>
+    <w:p>
+      <w:pPr>
+        <w:pStyle w:val="Heading3"/>
+      </w:pPr>
+      <w:r>
+        <w:t xml:space="preserve">Day 8 — Microsoft </w:t>
+      </w:r>
+      <w:proofErr w:type="spellStart"/>
+      <w:r>
+        <w:t>Entra</w:t>
+      </w:r>
+      <w:proofErr w:type="spellEnd"/>
+      <w:r>
+        <w:t xml:space="preserve"> ID SSO (OAuth2/OIDC)</w:t>
+      </w:r>
+    </w:p>
+    <w:p>
+      <w:pPr>
+        <w:pStyle w:val="NormalWeb"/>
+      </w:pPr>
+      <w:r>
+        <w:t>Learn:</w:t>
+      </w:r>
+    </w:p>
+    <w:p>
+      <w:pPr>
+        <w:pStyle w:val="NormalWeb"/>
+        <w:numPr>
+          <w:ilvl w:val="0"/>
+          <w:numId w:val="24"/>
+        </w:numPr>
+      </w:pPr>
+      <w:r>
+        <w:t xml:space="preserve">tokens: </w:t>
+      </w:r>
+      <w:proofErr w:type="spellStart"/>
+      <w:r>
+        <w:t>id_token</w:t>
+      </w:r>
+      <w:proofErr w:type="spellEnd"/>
+      <w:r>
+        <w:t xml:space="preserve"> vs </w:t>
+      </w:r>
+      <w:proofErr w:type="spellStart"/>
+      <w:r>
+        <w:t>access_token</w:t>
+      </w:r>
+      <w:proofErr w:type="spellEnd"/>
+      <w:r>
+        <w:t>, scopes, audience, issuer</w:t>
+      </w:r>
+    </w:p>
+    <w:p>
+      <w:pPr>
+        <w:pStyle w:val="NormalWeb"/>
+        <w:numPr>
+          <w:ilvl w:val="0"/>
+          <w:numId w:val="24"/>
+        </w:numPr>
+      </w:pPr>
+      <w:r>
+        <w:t xml:space="preserve">flows to know: </w:t>
+      </w:r>
+      <w:proofErr w:type="spellStart"/>
+      <w:r>
+        <w:rPr>
+          <w:rStyle w:val="Strong"/>
+        </w:rPr>
+        <w:t>Auth</w:t>
+      </w:r>
+      <w:proofErr w:type="spellEnd"/>
+      <w:r>
+        <w:rPr>
+          <w:rStyle w:val="Strong"/>
+        </w:rPr>
+        <w:t xml:space="preserve"> Code + PKCE</w:t>
+      </w:r>
+      <w:r>
+        <w:t xml:space="preserve">, </w:t>
+      </w:r>
+      <w:r>
+        <w:rPr>
+          <w:rStyle w:val="Strong"/>
+        </w:rPr>
+        <w:t>Client Credentials</w:t>
+      </w:r>
+      <w:r>
+        <w:t xml:space="preserve">, </w:t>
+      </w:r>
+      <w:r>
+        <w:rPr>
+          <w:rStyle w:val="Strong"/>
+        </w:rPr>
+        <w:t>OBO</w:t>
+      </w:r>
+    </w:p>
+    <w:p>
+      <w:pPr>
+        <w:pStyle w:val="NormalWeb"/>
+        <w:numPr>
+          <w:ilvl w:val="0"/>
+          <w:numId w:val="24"/>
+        </w:numPr>
+      </w:pPr>
+      <w:r>
+        <w:t>common bugs: wrong audience, clock skew, missing scopes/roles</w:t>
+      </w:r>
+      <w:r>
+        <w:br/>
+        <w:t>Practice:</w:t>
+      </w:r>
+    </w:p>
+    <w:p>
+      <w:pPr>
+        <w:pStyle w:val="NormalWeb"/>
+        <w:numPr>
+          <w:ilvl w:val="0"/>
+          <w:numId w:val="24"/>
+        </w:numPr>
+      </w:pPr>
+      <w:r>
+        <w:t>be able to draw the flow + where validation happens</w:t>
+      </w:r>
+    </w:p>
+    <w:p>
+      <w:pPr>
+        <w:pStyle w:val="Heading3"/>
+      </w:pPr>
+      <w:r>
+        <w:t>Day 9 — AWS (Associate-level but interview-ready)</w:t>
+      </w:r>
+    </w:p>
+    <w:p>
+      <w:pPr>
+        <w:pStyle w:val="NormalWeb"/>
+      </w:pPr>
+      <w:r>
+        <w:t>Learn:</w:t>
+      </w:r>
+    </w:p>
+    <w:p>
+      <w:pPr>
+        <w:pStyle w:val="NormalWeb"/>
+        <w:numPr>
+          <w:ilvl w:val="0"/>
+          <w:numId w:val="25"/>
+        </w:numPr>
+      </w:pPr>
+      <w:r>
+        <w:rPr>
+          <w:rStyle w:val="Strong"/>
+        </w:rPr>
+        <w:lastRenderedPageBreak/>
+        <w:t>S3</w:t>
+      </w:r>
+      <w:r>
+        <w:t>: encryption, versioning, lifecycle, events</w:t>
+      </w:r>
+    </w:p>
+    <w:p>
+      <w:pPr>
+        <w:pStyle w:val="NormalWeb"/>
+        <w:numPr>
+          <w:ilvl w:val="0"/>
+          <w:numId w:val="25"/>
+        </w:numPr>
+      </w:pPr>
+      <w:r>
+        <w:rPr>
+          <w:rStyle w:val="Strong"/>
+        </w:rPr>
+        <w:t>RDS</w:t>
+      </w:r>
+      <w:r>
+        <w:t>: backups, Multi-AZ concept, read replicas basics</w:t>
+      </w:r>
+    </w:p>
+    <w:p>
+      <w:pPr>
+        <w:pStyle w:val="NormalWeb"/>
+        <w:numPr>
+          <w:ilvl w:val="0"/>
+          <w:numId w:val="25"/>
+        </w:numPr>
+      </w:pPr>
+      <w:r>
+        <w:rPr>
+          <w:rStyle w:val="Strong"/>
+        </w:rPr>
+        <w:t>Lambda</w:t>
+      </w:r>
+      <w:r>
+        <w:t>: triggers, timeouts, retries, idempotency</w:t>
+      </w:r>
+    </w:p>
+    <w:p>
+      <w:pPr>
+        <w:pStyle w:val="NormalWeb"/>
+        <w:numPr>
+          <w:ilvl w:val="0"/>
+          <w:numId w:val="25"/>
+        </w:numPr>
+      </w:pPr>
+      <w:r>
+        <w:rPr>
+          <w:rStyle w:val="Strong"/>
+        </w:rPr>
+        <w:t>ECS</w:t>
+      </w:r>
+      <w:r>
+        <w:t xml:space="preserve">: tasks/services, </w:t>
+      </w:r>
+      <w:proofErr w:type="spellStart"/>
+      <w:r>
+        <w:t>Fargate</w:t>
+      </w:r>
+      <w:proofErr w:type="spellEnd"/>
+      <w:r>
+        <w:t xml:space="preserve"> concept; compare ECS vs AKS</w:t>
+      </w:r>
+      <w:r>
+        <w:br/>
+        <w:t>Practice:</w:t>
+      </w:r>
+    </w:p>
+    <w:p>
+      <w:pPr>
+        <w:pStyle w:val="NormalWeb"/>
+        <w:numPr>
+          <w:ilvl w:val="0"/>
+          <w:numId w:val="25"/>
+        </w:numPr>
+      </w:pPr>
+      <w:r>
+        <w:t>explain “when ECS/Lambda vs microservices on AKS”</w:t>
+      </w:r>
+    </w:p>
+    <w:p>
+      <w:pPr>
+        <w:pStyle w:val="Heading3"/>
+      </w:pPr>
+      <w:r>
+        <w:t>Day 10 — Microservices operational concerns</w:t>
+      </w:r>
+    </w:p>
+    <w:p>
+      <w:pPr>
+        <w:pStyle w:val="NormalWeb"/>
+      </w:pPr>
+      <w:r>
+        <w:t>Learn:</w:t>
+      </w:r>
+    </w:p>
+    <w:p>
+      <w:pPr>
+        <w:pStyle w:val="NormalWeb"/>
+        <w:numPr>
+          <w:ilvl w:val="0"/>
+          <w:numId w:val="26"/>
+        </w:numPr>
+      </w:pPr>
+      <w:r>
+        <w:t>configuration/secrets strategy, graceful shutdown</w:t>
+      </w:r>
+    </w:p>
+    <w:p>
+      <w:pPr>
+        <w:pStyle w:val="NormalWeb"/>
+        <w:numPr>
+          <w:ilvl w:val="0"/>
+          <w:numId w:val="26"/>
+        </w:numPr>
+      </w:pPr>
+      <w:r>
+        <w:t>backward/forward compatibility for events</w:t>
+      </w:r>
+    </w:p>
+    <w:p>
+      <w:pPr>
+        <w:pStyle w:val="NormalWeb"/>
+        <w:numPr>
+          <w:ilvl w:val="0"/>
+          <w:numId w:val="26"/>
+        </w:numPr>
+      </w:pPr>
+      <w:r>
+        <w:t>observability basics: logs/metrics/traces, golden signals</w:t>
+      </w:r>
+      <w:r>
+        <w:br/>
+        <w:t>Practice:</w:t>
+      </w:r>
+    </w:p>
+    <w:p>
+      <w:pPr>
+        <w:pStyle w:val="NormalWeb"/>
+        <w:numPr>
+          <w:ilvl w:val="0"/>
+          <w:numId w:val="26"/>
+        </w:numPr>
+      </w:pPr>
+      <w:r>
+        <w:t>debugging story: “message duplicated”, “consumer lag”, “slow DB”</w:t>
+      </w:r>
+    </w:p>
+    <w:p>
+      <w:pPr>
+        <w:pStyle w:val="Heading3"/>
+      </w:pPr>
+      <w:r>
+        <w:t>Day 11 — DDD (nice-to-have, but valuable)</w:t>
+      </w:r>
+    </w:p>
+    <w:p>
+      <w:pPr>
+        <w:pStyle w:val="NormalWeb"/>
+      </w:pPr>
+      <w:r>
+        <w:t>Learn:</w:t>
+      </w:r>
+    </w:p>
+    <w:p>
+      <w:pPr>
+        <w:pStyle w:val="NormalWeb"/>
+        <w:numPr>
+          <w:ilvl w:val="0"/>
+          <w:numId w:val="27"/>
+        </w:numPr>
+      </w:pPr>
+      <w:r>
+        <w:t>bounded context, aggregates, entities vs value objects</w:t>
+      </w:r>
+    </w:p>
+    <w:p>
+      <w:pPr>
+        <w:pStyle w:val="NormalWeb"/>
+        <w:numPr>
+          <w:ilvl w:val="0"/>
+          <w:numId w:val="27"/>
+        </w:numPr>
+      </w:pPr>
+      <w:r>
+        <w:t>domain events vs integration events</w:t>
+      </w:r>
+    </w:p>
+    <w:p>
+      <w:pPr>
+        <w:pStyle w:val="NormalWeb"/>
+        <w:numPr>
+          <w:ilvl w:val="0"/>
+          <w:numId w:val="27"/>
+        </w:numPr>
+      </w:pPr>
+      <w:r>
+        <w:t>anti-corruption layer, ubiquitous language</w:t>
+      </w:r>
+      <w:r>
+        <w:br/>
+        <w:t>Practice:</w:t>
+      </w:r>
+    </w:p>
+    <w:p>
+      <w:pPr>
+        <w:pStyle w:val="NormalWeb"/>
+        <w:numPr>
+          <w:ilvl w:val="0"/>
+          <w:numId w:val="27"/>
+        </w:numPr>
+      </w:pPr>
+      <w:r>
+        <w:t>identify 1–2 aggregates and invariants (how you enforce consistency)</w:t>
+      </w:r>
+    </w:p>
+    <w:p>
+      <w:pPr>
+        <w:pStyle w:val="Heading3"/>
+      </w:pPr>
+      <w:r>
+        <w:t>Day 12 — Data Warehouse architecture</w:t>
+      </w:r>
+    </w:p>
+    <w:p>
+      <w:pPr>
+        <w:pStyle w:val="NormalWeb"/>
+      </w:pPr>
+      <w:r>
+        <w:t>Learn:</w:t>
+      </w:r>
+    </w:p>
+    <w:p>
+      <w:pPr>
+        <w:pStyle w:val="NormalWeb"/>
+        <w:numPr>
+          <w:ilvl w:val="0"/>
+          <w:numId w:val="28"/>
+        </w:numPr>
+      </w:pPr>
+      <w:r>
+        <w:t>OLTP vs OLAP, star schema (fact/dimension)</w:t>
+      </w:r>
+    </w:p>
+    <w:p>
+      <w:pPr>
+        <w:pStyle w:val="NormalWeb"/>
+        <w:numPr>
+          <w:ilvl w:val="0"/>
+          <w:numId w:val="28"/>
+        </w:numPr>
+      </w:pPr>
+      <w:r>
+        <w:t>SCD (slowly changing dimensions) concept</w:t>
+      </w:r>
+    </w:p>
+    <w:p>
+      <w:pPr>
+        <w:pStyle w:val="NormalWeb"/>
+        <w:numPr>
+          <w:ilvl w:val="0"/>
+          <w:numId w:val="28"/>
+        </w:numPr>
+      </w:pPr>
+      <w:r>
+        <w:t>incremental load, CDC idea, data quality checks</w:t>
+      </w:r>
+      <w:r>
+        <w:br/>
+        <w:t>Practice:</w:t>
+      </w:r>
+    </w:p>
+    <w:p>
+      <w:pPr>
+        <w:pStyle w:val="NormalWeb"/>
+        <w:numPr>
+          <w:ilvl w:val="0"/>
+          <w:numId w:val="28"/>
+        </w:numPr>
+      </w:pPr>
+      <w:r>
+        <w:t>turn OLTP tables into a simple star schema (design-only)</w:t>
+      </w:r>
+    </w:p>
+    <w:p>
+      <w:pPr>
+        <w:pStyle w:val="Heading3"/>
+      </w:pPr>
+      <w:r>
+        <w:t>Day 13 — ETL + Power BI (what to say in interviews)</w:t>
+      </w:r>
+    </w:p>
+    <w:p>
+      <w:pPr>
+        <w:pStyle w:val="NormalWeb"/>
+      </w:pPr>
+      <w:r>
+        <w:t>Learn:</w:t>
+      </w:r>
+    </w:p>
+    <w:p>
+      <w:pPr>
+        <w:pStyle w:val="NormalWeb"/>
+        <w:numPr>
+          <w:ilvl w:val="0"/>
+          <w:numId w:val="29"/>
+        </w:numPr>
+      </w:pPr>
+      <w:r>
+        <w:t>ETL vs ELT, staging → transform → serve</w:t>
+      </w:r>
+    </w:p>
+    <w:p>
+      <w:pPr>
+        <w:pStyle w:val="NormalWeb"/>
+        <w:numPr>
+          <w:ilvl w:val="0"/>
+          <w:numId w:val="29"/>
+        </w:numPr>
+      </w:pPr>
+      <w:r>
+        <w:t>Power BI: measures vs columns, refresh, model relationships</w:t>
+      </w:r>
+    </w:p>
+    <w:p>
+      <w:pPr>
+        <w:pStyle w:val="NormalWeb"/>
+        <w:numPr>
+          <w:ilvl w:val="0"/>
+          <w:numId w:val="29"/>
+        </w:numPr>
+      </w:pPr>
+      <w:r>
+        <w:t>KPI thinking: throughput, revenue, conversion, SLA</w:t>
+      </w:r>
+      <w:r>
+        <w:br/>
+        <w:t>Practice:</w:t>
+      </w:r>
+    </w:p>
+    <w:p>
+      <w:pPr>
+        <w:pStyle w:val="NormalWeb"/>
+        <w:numPr>
+          <w:ilvl w:val="0"/>
+          <w:numId w:val="29"/>
+        </w:numPr>
+      </w:pPr>
+      <w:r>
+        <w:t>define 5 KPIs + how they’re computed from facts/dims</w:t>
+      </w:r>
+    </w:p>
+    <w:p>
+      <w:pPr>
+        <w:pStyle w:val="Heading3"/>
+      </w:pPr>
+      <w:r>
+        <w:t xml:space="preserve">Day 14 — </w:t>
+      </w:r>
+      <w:proofErr w:type="spellStart"/>
+      <w:r>
+        <w:t>Camunda</w:t>
+      </w:r>
+      <w:proofErr w:type="spellEnd"/>
+      <w:r>
+        <w:t xml:space="preserve"> BPM (interview-level)</w:t>
+      </w:r>
+    </w:p>
+    <w:p>
+      <w:pPr>
+        <w:pStyle w:val="NormalWeb"/>
+      </w:pPr>
+      <w:r>
+        <w:t>Learn:</w:t>
+      </w:r>
+    </w:p>
+    <w:p>
+      <w:pPr>
+        <w:pStyle w:val="NormalWeb"/>
+        <w:numPr>
+          <w:ilvl w:val="0"/>
+          <w:numId w:val="30"/>
+        </w:numPr>
+      </w:pPr>
+      <w:r>
+        <w:lastRenderedPageBreak/>
+        <w:t>BPMN basics: tasks, gateways, timers, subprocess</w:t>
+      </w:r>
+    </w:p>
+    <w:p>
+      <w:pPr>
+        <w:pStyle w:val="NormalWeb"/>
+        <w:numPr>
+          <w:ilvl w:val="0"/>
+          <w:numId w:val="30"/>
+        </w:numPr>
+      </w:pPr>
+      <w:r>
+        <w:t>orchestration vs choreography (</w:t>
+      </w:r>
+      <w:proofErr w:type="spellStart"/>
+      <w:r>
+        <w:t>Camunda</w:t>
+      </w:r>
+      <w:proofErr w:type="spellEnd"/>
+      <w:r>
+        <w:t xml:space="preserve"> as orchestrator)</w:t>
+      </w:r>
+    </w:p>
+    <w:p>
+      <w:pPr>
+        <w:pStyle w:val="NormalWeb"/>
+        <w:numPr>
+          <w:ilvl w:val="0"/>
+          <w:numId w:val="30"/>
+        </w:numPr>
+      </w:pPr>
+      <w:r>
+        <w:t>external task worker pattern and failure handling</w:t>
+      </w:r>
+      <w:r>
+        <w:br/>
+        <w:t>Practice:</w:t>
+      </w:r>
+    </w:p>
+    <w:p>
+      <w:pPr>
+        <w:pStyle w:val="NormalWeb"/>
+        <w:numPr>
+          <w:ilvl w:val="0"/>
+          <w:numId w:val="30"/>
+        </w:numPr>
+      </w:pPr>
+      <w:r>
+        <w:t xml:space="preserve">explain when </w:t>
+      </w:r>
+      <w:proofErr w:type="spellStart"/>
+      <w:r>
+        <w:t>Camunda</w:t>
+      </w:r>
+      <w:proofErr w:type="spellEnd"/>
+      <w:r>
+        <w:t xml:space="preserve"> is worth it vs “events + sagas only”</w:t>
       </w:r>
     </w:p>
     <w:p>
@@ -685,639 +1328,6 @@
         </w:rPr>
         <w:pict>
           <v:rect id="_x0000_i1026" alt="" style="width:451pt;height:.05pt;mso-width-percent:0;mso-height-percent:0;mso-width-percent:0;mso-height-percent:0" o:hralign="center" o:hrstd="t" o:hr="t" fillcolor="#a0a0a0" stroked="f"/>
-        </w:pict>
-      </w:r>
-    </w:p>
-    <w:p>
-      <w:pPr>
-        <w:pStyle w:val="Heading2"/>
-      </w:pPr>
-      <w:r>
-        <w:t xml:space="preserve">Week 2 — </w:t>
-      </w:r>
-      <w:proofErr w:type="spellStart"/>
-      <w:r>
-        <w:t>Entra</w:t>
-      </w:r>
-      <w:proofErr w:type="spellEnd"/>
-      <w:r>
-        <w:t xml:space="preserve"> SSO + AWS + DDD + Data/BI + </w:t>
-      </w:r>
-      <w:proofErr w:type="spellStart"/>
-      <w:r>
-        <w:t>Camunda</w:t>
-      </w:r>
-      <w:proofErr w:type="spellEnd"/>
-    </w:p>
-    <w:p>
-      <w:pPr>
-        <w:pStyle w:val="Heading3"/>
-      </w:pPr>
-      <w:r>
-        <w:t xml:space="preserve">Day 8 — Microsoft </w:t>
-      </w:r>
-      <w:proofErr w:type="spellStart"/>
-      <w:r>
-        <w:t>Entra</w:t>
-      </w:r>
-      <w:proofErr w:type="spellEnd"/>
-      <w:r>
-        <w:t xml:space="preserve"> ID SSO (OAuth2/OIDC)</w:t>
-      </w:r>
-    </w:p>
-    <w:p>
-      <w:pPr>
-        <w:pStyle w:val="NormalWeb"/>
-      </w:pPr>
-      <w:r>
-        <w:t>Learn:</w:t>
-      </w:r>
-    </w:p>
-    <w:p>
-      <w:pPr>
-        <w:pStyle w:val="NormalWeb"/>
-        <w:numPr>
-          <w:ilvl w:val="0"/>
-          <w:numId w:val="24"/>
-        </w:numPr>
-      </w:pPr>
-      <w:r>
-        <w:t xml:space="preserve">tokens: </w:t>
-      </w:r>
-      <w:proofErr w:type="spellStart"/>
-      <w:r>
-        <w:t>id_token</w:t>
-      </w:r>
-      <w:proofErr w:type="spellEnd"/>
-      <w:r>
-        <w:t xml:space="preserve"> vs </w:t>
-      </w:r>
-      <w:proofErr w:type="spellStart"/>
-      <w:r>
-        <w:t>access_token</w:t>
-      </w:r>
-      <w:proofErr w:type="spellEnd"/>
-      <w:r>
-        <w:t>, scopes, audience, issuer</w:t>
-      </w:r>
-    </w:p>
-    <w:p>
-      <w:pPr>
-        <w:pStyle w:val="NormalWeb"/>
-        <w:numPr>
-          <w:ilvl w:val="0"/>
-          <w:numId w:val="24"/>
-        </w:numPr>
-      </w:pPr>
-      <w:r>
-        <w:t xml:space="preserve">flows to know: </w:t>
-      </w:r>
-      <w:proofErr w:type="spellStart"/>
-      <w:r>
-        <w:rPr>
-          <w:rStyle w:val="Strong"/>
-        </w:rPr>
-        <w:t>Auth</w:t>
-      </w:r>
-      <w:proofErr w:type="spellEnd"/>
-      <w:r>
-        <w:rPr>
-          <w:rStyle w:val="Strong"/>
-        </w:rPr>
-        <w:t xml:space="preserve"> Code + PKCE</w:t>
-      </w:r>
-      <w:r>
-        <w:t xml:space="preserve">, </w:t>
-      </w:r>
-      <w:r>
-        <w:rPr>
-          <w:rStyle w:val="Strong"/>
-        </w:rPr>
-        <w:t>Client Credentials</w:t>
-      </w:r>
-      <w:r>
-        <w:t xml:space="preserve">, </w:t>
-      </w:r>
-      <w:r>
-        <w:rPr>
-          <w:rStyle w:val="Strong"/>
-        </w:rPr>
-        <w:t>OBO</w:t>
-      </w:r>
-    </w:p>
-    <w:p>
-      <w:pPr>
-        <w:pStyle w:val="NormalWeb"/>
-        <w:numPr>
-          <w:ilvl w:val="0"/>
-          <w:numId w:val="24"/>
-        </w:numPr>
-      </w:pPr>
-      <w:r>
-        <w:t>common bugs: wrong audience, clock skew, missing scopes/roles</w:t>
-      </w:r>
-      <w:r>
-        <w:br/>
-        <w:t>Practice:</w:t>
-      </w:r>
-    </w:p>
-    <w:p>
-      <w:pPr>
-        <w:pStyle w:val="NormalWeb"/>
-        <w:numPr>
-          <w:ilvl w:val="0"/>
-          <w:numId w:val="24"/>
-        </w:numPr>
-      </w:pPr>
-      <w:r>
-        <w:t>be able to draw the flow + where validation happens</w:t>
-      </w:r>
-    </w:p>
-    <w:p>
-      <w:pPr>
-        <w:pStyle w:val="Heading3"/>
-      </w:pPr>
-      <w:r>
-        <w:t>Day 9 — AWS (Associate-level but interview-ready)</w:t>
-      </w:r>
-    </w:p>
-    <w:p>
-      <w:pPr>
-        <w:pStyle w:val="NormalWeb"/>
-      </w:pPr>
-      <w:r>
-        <w:t>Learn:</w:t>
-      </w:r>
-    </w:p>
-    <w:p>
-      <w:pPr>
-        <w:pStyle w:val="NormalWeb"/>
-        <w:numPr>
-          <w:ilvl w:val="0"/>
-          <w:numId w:val="25"/>
-        </w:numPr>
-      </w:pPr>
-      <w:r>
-        <w:rPr>
-          <w:rStyle w:val="Strong"/>
-        </w:rPr>
-        <w:lastRenderedPageBreak/>
-        <w:t>S3</w:t>
-      </w:r>
-      <w:r>
-        <w:t>: encryption, versioning, lifecycle, events</w:t>
-      </w:r>
-    </w:p>
-    <w:p>
-      <w:pPr>
-        <w:pStyle w:val="NormalWeb"/>
-        <w:numPr>
-          <w:ilvl w:val="0"/>
-          <w:numId w:val="25"/>
-        </w:numPr>
-      </w:pPr>
-      <w:r>
-        <w:rPr>
-          <w:rStyle w:val="Strong"/>
-        </w:rPr>
-        <w:t>RDS</w:t>
-      </w:r>
-      <w:r>
-        <w:t>: backups, Multi-AZ concept, read replicas basics</w:t>
-      </w:r>
-    </w:p>
-    <w:p>
-      <w:pPr>
-        <w:pStyle w:val="NormalWeb"/>
-        <w:numPr>
-          <w:ilvl w:val="0"/>
-          <w:numId w:val="25"/>
-        </w:numPr>
-      </w:pPr>
-      <w:r>
-        <w:rPr>
-          <w:rStyle w:val="Strong"/>
-        </w:rPr>
-        <w:t>Lambda</w:t>
-      </w:r>
-      <w:r>
-        <w:t>: triggers, timeouts, retries, idempotency</w:t>
-      </w:r>
-    </w:p>
-    <w:p>
-      <w:pPr>
-        <w:pStyle w:val="NormalWeb"/>
-        <w:numPr>
-          <w:ilvl w:val="0"/>
-          <w:numId w:val="25"/>
-        </w:numPr>
-      </w:pPr>
-      <w:r>
-        <w:rPr>
-          <w:rStyle w:val="Strong"/>
-        </w:rPr>
-        <w:t>ECS</w:t>
-      </w:r>
-      <w:r>
-        <w:t xml:space="preserve">: tasks/services, </w:t>
-      </w:r>
-      <w:proofErr w:type="spellStart"/>
-      <w:r>
-        <w:t>Fargate</w:t>
-      </w:r>
-      <w:proofErr w:type="spellEnd"/>
-      <w:r>
-        <w:t xml:space="preserve"> concept; compare ECS vs AKS</w:t>
-      </w:r>
-      <w:r>
-        <w:br/>
-        <w:t>Practice:</w:t>
-      </w:r>
-    </w:p>
-    <w:p>
-      <w:pPr>
-        <w:pStyle w:val="NormalWeb"/>
-        <w:numPr>
-          <w:ilvl w:val="0"/>
-          <w:numId w:val="25"/>
-        </w:numPr>
-      </w:pPr>
-      <w:r>
-        <w:t>explain “when ECS/Lambda vs microservices on AKS”</w:t>
-      </w:r>
-    </w:p>
-    <w:p>
-      <w:pPr>
-        <w:pStyle w:val="Heading3"/>
-      </w:pPr>
-      <w:r>
-        <w:t>Day 10 — Microservices operational concerns</w:t>
-      </w:r>
-    </w:p>
-    <w:p>
-      <w:pPr>
-        <w:pStyle w:val="NormalWeb"/>
-      </w:pPr>
-      <w:r>
-        <w:t>Learn:</w:t>
-      </w:r>
-    </w:p>
-    <w:p>
-      <w:pPr>
-        <w:pStyle w:val="NormalWeb"/>
-        <w:numPr>
-          <w:ilvl w:val="0"/>
-          <w:numId w:val="26"/>
-        </w:numPr>
-      </w:pPr>
-      <w:r>
-        <w:t>configuration/secrets strategy, graceful shutdown</w:t>
-      </w:r>
-    </w:p>
-    <w:p>
-      <w:pPr>
-        <w:pStyle w:val="NormalWeb"/>
-        <w:numPr>
-          <w:ilvl w:val="0"/>
-          <w:numId w:val="26"/>
-        </w:numPr>
-      </w:pPr>
-      <w:r>
-        <w:t>backward/forward compatibility for events</w:t>
-      </w:r>
-    </w:p>
-    <w:p>
-      <w:pPr>
-        <w:pStyle w:val="NormalWeb"/>
-        <w:numPr>
-          <w:ilvl w:val="0"/>
-          <w:numId w:val="26"/>
-        </w:numPr>
-      </w:pPr>
-      <w:r>
-        <w:t>observability basics: logs/metrics/traces, golden signals</w:t>
-      </w:r>
-      <w:r>
-        <w:br/>
-        <w:t>Practice:</w:t>
-      </w:r>
-    </w:p>
-    <w:p>
-      <w:pPr>
-        <w:pStyle w:val="NormalWeb"/>
-        <w:numPr>
-          <w:ilvl w:val="0"/>
-          <w:numId w:val="26"/>
-        </w:numPr>
-      </w:pPr>
-      <w:r>
-        <w:t>debugging story: “message duplicated”, “consumer lag”, “slow DB”</w:t>
-      </w:r>
-    </w:p>
-    <w:p>
-      <w:pPr>
-        <w:pStyle w:val="Heading3"/>
-      </w:pPr>
-      <w:r>
-        <w:t>Day 11 — DDD (nice-to-have, but valuable)</w:t>
-      </w:r>
-    </w:p>
-    <w:p>
-      <w:pPr>
-        <w:pStyle w:val="NormalWeb"/>
-      </w:pPr>
-      <w:r>
-        <w:t>Learn:</w:t>
-      </w:r>
-    </w:p>
-    <w:p>
-      <w:pPr>
-        <w:pStyle w:val="NormalWeb"/>
-        <w:numPr>
-          <w:ilvl w:val="0"/>
-          <w:numId w:val="27"/>
-        </w:numPr>
-      </w:pPr>
-      <w:r>
-        <w:t>bounded context, aggregates, entities vs value objects</w:t>
-      </w:r>
-    </w:p>
-    <w:p>
-      <w:pPr>
-        <w:pStyle w:val="NormalWeb"/>
-        <w:numPr>
-          <w:ilvl w:val="0"/>
-          <w:numId w:val="27"/>
-        </w:numPr>
-      </w:pPr>
-      <w:r>
-        <w:t>domain events vs integration events</w:t>
-      </w:r>
-    </w:p>
-    <w:p>
-      <w:pPr>
-        <w:pStyle w:val="NormalWeb"/>
-        <w:numPr>
-          <w:ilvl w:val="0"/>
-          <w:numId w:val="27"/>
-        </w:numPr>
-      </w:pPr>
-      <w:r>
-        <w:t>anti-corruption layer, ubiquitous language</w:t>
-      </w:r>
-      <w:r>
-        <w:br/>
-        <w:t>Practice:</w:t>
-      </w:r>
-    </w:p>
-    <w:p>
-      <w:pPr>
-        <w:pStyle w:val="NormalWeb"/>
-        <w:numPr>
-          <w:ilvl w:val="0"/>
-          <w:numId w:val="27"/>
-        </w:numPr>
-      </w:pPr>
-      <w:r>
-        <w:t>identify 1–2 aggregates and invariants (how you enforce consistency)</w:t>
-      </w:r>
-    </w:p>
-    <w:p>
-      <w:pPr>
-        <w:pStyle w:val="Heading3"/>
-      </w:pPr>
-      <w:r>
-        <w:t>Day 12 — Data Warehouse architecture</w:t>
-      </w:r>
-    </w:p>
-    <w:p>
-      <w:pPr>
-        <w:pStyle w:val="NormalWeb"/>
-      </w:pPr>
-      <w:r>
-        <w:t>Learn:</w:t>
-      </w:r>
-    </w:p>
-    <w:p>
-      <w:pPr>
-        <w:pStyle w:val="NormalWeb"/>
-        <w:numPr>
-          <w:ilvl w:val="0"/>
-          <w:numId w:val="28"/>
-        </w:numPr>
-      </w:pPr>
-      <w:r>
-        <w:t>OLTP vs OLAP, star schema (fact/dimension)</w:t>
-      </w:r>
-    </w:p>
-    <w:p>
-      <w:pPr>
-        <w:pStyle w:val="NormalWeb"/>
-        <w:numPr>
-          <w:ilvl w:val="0"/>
-          <w:numId w:val="28"/>
-        </w:numPr>
-      </w:pPr>
-      <w:r>
-        <w:t>SCD (slowly changing dimensions) concept</w:t>
-      </w:r>
-    </w:p>
-    <w:p>
-      <w:pPr>
-        <w:pStyle w:val="NormalWeb"/>
-        <w:numPr>
-          <w:ilvl w:val="0"/>
-          <w:numId w:val="28"/>
-        </w:numPr>
-      </w:pPr>
-      <w:r>
-        <w:t>incremental load, CDC idea, data quality checks</w:t>
-      </w:r>
-      <w:r>
-        <w:br/>
-        <w:t>Practice:</w:t>
-      </w:r>
-    </w:p>
-    <w:p>
-      <w:pPr>
-        <w:pStyle w:val="NormalWeb"/>
-        <w:numPr>
-          <w:ilvl w:val="0"/>
-          <w:numId w:val="28"/>
-        </w:numPr>
-      </w:pPr>
-      <w:r>
-        <w:t>turn OLTP tables into a simple star schema (design-only)</w:t>
-      </w:r>
-    </w:p>
-    <w:p>
-      <w:pPr>
-        <w:pStyle w:val="Heading3"/>
-      </w:pPr>
-      <w:r>
-        <w:t>Day 13 — ETL + Power BI (what to say in interviews)</w:t>
-      </w:r>
-    </w:p>
-    <w:p>
-      <w:pPr>
-        <w:pStyle w:val="NormalWeb"/>
-      </w:pPr>
-      <w:r>
-        <w:t>Learn:</w:t>
-      </w:r>
-    </w:p>
-    <w:p>
-      <w:pPr>
-        <w:pStyle w:val="NormalWeb"/>
-        <w:numPr>
-          <w:ilvl w:val="0"/>
-          <w:numId w:val="29"/>
-        </w:numPr>
-      </w:pPr>
-      <w:r>
-        <w:t>ETL vs ELT, staging → transform → serve</w:t>
-      </w:r>
-    </w:p>
-    <w:p>
-      <w:pPr>
-        <w:pStyle w:val="NormalWeb"/>
-        <w:numPr>
-          <w:ilvl w:val="0"/>
-          <w:numId w:val="29"/>
-        </w:numPr>
-      </w:pPr>
-      <w:r>
-        <w:t>Power BI: measures vs columns, refresh, model relationships</w:t>
-      </w:r>
-    </w:p>
-    <w:p>
-      <w:pPr>
-        <w:pStyle w:val="NormalWeb"/>
-        <w:numPr>
-          <w:ilvl w:val="0"/>
-          <w:numId w:val="29"/>
-        </w:numPr>
-      </w:pPr>
-      <w:r>
-        <w:t>KPI thinking: throughput, revenue, conversion, SLA</w:t>
-      </w:r>
-      <w:r>
-        <w:br/>
-        <w:t>Practice:</w:t>
-      </w:r>
-    </w:p>
-    <w:p>
-      <w:pPr>
-        <w:pStyle w:val="NormalWeb"/>
-        <w:numPr>
-          <w:ilvl w:val="0"/>
-          <w:numId w:val="29"/>
-        </w:numPr>
-      </w:pPr>
-      <w:r>
-        <w:t>define 5 KPIs + how they’re computed from facts/dims</w:t>
-      </w:r>
-    </w:p>
-    <w:p>
-      <w:pPr>
-        <w:pStyle w:val="Heading3"/>
-      </w:pPr>
-      <w:r>
-        <w:t xml:space="preserve">Day 14 — </w:t>
-      </w:r>
-      <w:proofErr w:type="spellStart"/>
-      <w:r>
-        <w:t>Camunda</w:t>
-      </w:r>
-      <w:proofErr w:type="spellEnd"/>
-      <w:r>
-        <w:t xml:space="preserve"> BPM (interview-level)</w:t>
-      </w:r>
-    </w:p>
-    <w:p>
-      <w:pPr>
-        <w:pStyle w:val="NormalWeb"/>
-      </w:pPr>
-      <w:r>
-        <w:t>Learn:</w:t>
-      </w:r>
-    </w:p>
-    <w:p>
-      <w:pPr>
-        <w:pStyle w:val="NormalWeb"/>
-        <w:numPr>
-          <w:ilvl w:val="0"/>
-          <w:numId w:val="30"/>
-        </w:numPr>
-      </w:pPr>
-      <w:r>
-        <w:lastRenderedPageBreak/>
-        <w:t>BPMN basics: tasks, gateways, timers, subprocess</w:t>
-      </w:r>
-    </w:p>
-    <w:p>
-      <w:pPr>
-        <w:pStyle w:val="NormalWeb"/>
-        <w:numPr>
-          <w:ilvl w:val="0"/>
-          <w:numId w:val="30"/>
-        </w:numPr>
-      </w:pPr>
-      <w:r>
-        <w:t>orchestration vs choreography (</w:t>
-      </w:r>
-      <w:proofErr w:type="spellStart"/>
-      <w:r>
-        <w:t>Camunda</w:t>
-      </w:r>
-      <w:proofErr w:type="spellEnd"/>
-      <w:r>
-        <w:t xml:space="preserve"> as orchestrator)</w:t>
-      </w:r>
-    </w:p>
-    <w:p>
-      <w:pPr>
-        <w:pStyle w:val="NormalWeb"/>
-        <w:numPr>
-          <w:ilvl w:val="0"/>
-          <w:numId w:val="30"/>
-        </w:numPr>
-      </w:pPr>
-      <w:r>
-        <w:t>external task worker pattern and failure handling</w:t>
-      </w:r>
-      <w:r>
-        <w:br/>
-        <w:t>Practice:</w:t>
-      </w:r>
-    </w:p>
-    <w:p>
-      <w:pPr>
-        <w:pStyle w:val="NormalWeb"/>
-        <w:numPr>
-          <w:ilvl w:val="0"/>
-          <w:numId w:val="30"/>
-        </w:numPr>
-      </w:pPr>
-      <w:r>
-        <w:t xml:space="preserve">explain when </w:t>
-      </w:r>
-      <w:proofErr w:type="spellStart"/>
-      <w:r>
-        <w:t>Camunda</w:t>
-      </w:r>
-      <w:proofErr w:type="spellEnd"/>
-      <w:r>
-        <w:t xml:space="preserve"> is worth it vs “events + sagas only”</w:t>
-      </w:r>
-    </w:p>
-    <w:p>
-      <w:r>
-        <w:rPr>
-          <w:noProof/>
-        </w:rPr>
-        <w:pict>
-          <v:rect id="_x0000_i1025" alt="" style="width:451pt;height:.05pt;mso-width-percent:0;mso-height-percent:0;mso-width-percent:0;mso-height-percent:0" o:hralign="center" o:hrstd="t" o:hr="t" fillcolor="#a0a0a0" stroked="f"/>
         </w:pict>
       </w:r>
     </w:p>
@@ -1575,7 +1585,7 @@
 </file>
 
 <file path=word/numbering.xml><?xml version="1.0" encoding="utf-8"?>
-<w:numbering xmlns:wpc="http://schemas.microsoft.com/office/word/2010/wordprocessingCanvas" xmlns:cx="http://schemas.microsoft.com/office/drawing/2014/chartex" xmlns:cx1="http://schemas.microsoft.com/office/drawing/2015/9/8/chartex" xmlns:cx2="http://schemas.microsoft.com/office/drawing/2015/10/21/chartex" xmlns:cx3="http://schemas.microsoft.com/office/drawing/2016/5/9/chartex" xmlns:cx4="http://schemas.microsoft.com/office/drawing/2016/5/10/chartex" xmlns:cx5="http://schemas.microsoft.com/office/drawing/2016/5/11/chartex" xmlns:cx6="http://schemas.microsoft.com/office/drawing/2016/5/12/chartex" xmlns:cx7="http://schemas.microsoft.com/office/drawing/2016/5/13/chartex" xmlns:cx8="http://schemas.microsoft.com/office/drawing/2016/5/14/chartex" xmlns:mc="http://schemas.openxmlformats.org/markup-compatibility/2006" xmlns:aink="http://schemas.microsoft.com/office/drawing/2016/ink" xmlns:am3d="http://schemas.microsoft.com/office/drawing/2017/model3d" xmlns:o="urn:schemas-microsoft-com:office:office" xmlns:r="http://schemas.openxmlformats.org/officeDocument/2006/relationships" xmlns:m="http://schemas.openxmlformats.org/officeDocument/2006/math" xmlns:v="urn:schemas-microsoft-com:vml" xmlns:wp14="http://schemas.microsoft.com/office/word/2010/wordprocessingDrawing" xmlns:wp="http://schemas.openxmlformats.org/drawingml/2006/wordprocessingDrawing" xmlns:w10="urn:schemas-microsoft-com:office:word" xmlns:w="http://schemas.openxmlformats.org/wordprocessingml/2006/main" xmlns:w14="http://schemas.microsoft.com/office/word/2010/wordml" xmlns:w15="http://schemas.microsoft.com/office/word/2012/wordml" xmlns:w16cid="http://schemas.microsoft.com/office/word/2016/wordml/cid" xmlns:w16se="http://schemas.microsoft.com/office/word/2015/wordml/symex" xmlns:wpg="http://schemas.microsoft.com/office/word/2010/wordprocessingGroup" xmlns:wpi="http://schemas.microsoft.com/office/word/2010/wordprocessingInk" xmlns:wne="http://schemas.microsoft.com/office/word/2006/wordml" xmlns:wps="http://schemas.microsoft.com/office/word/2010/wordprocessingShape" mc:Ignorable="w14 w15 w16se w16cid wp14">
+<w:numbering xmlns:wpc="http://schemas.microsoft.com/office/word/2010/wordprocessingCanvas" xmlns:cx="http://schemas.microsoft.com/office/drawing/2014/chartex" xmlns:cx1="http://schemas.microsoft.com/office/drawing/2015/9/8/chartex" xmlns:mc="http://schemas.openxmlformats.org/markup-compatibility/2006" xmlns:o="urn:schemas-microsoft-com:office:office" xmlns:r="http://schemas.openxmlformats.org/officeDocument/2006/relationships" xmlns:m="http://schemas.openxmlformats.org/officeDocument/2006/math" xmlns:v="urn:schemas-microsoft-com:vml" xmlns:wp14="http://schemas.microsoft.com/office/word/2010/wordprocessingDrawing" xmlns:wp="http://schemas.openxmlformats.org/drawingml/2006/wordprocessingDrawing" xmlns:w10="urn:schemas-microsoft-com:office:word" xmlns:w="http://schemas.openxmlformats.org/wordprocessingml/2006/main" xmlns:w14="http://schemas.microsoft.com/office/word/2010/wordml" xmlns:w15="http://schemas.microsoft.com/office/word/2012/wordml" xmlns:w16se="http://schemas.microsoft.com/office/word/2015/wordml/symex" xmlns:wpg="http://schemas.microsoft.com/office/word/2010/wordprocessingGroup" xmlns:wpi="http://schemas.microsoft.com/office/word/2010/wordprocessingInk" xmlns:wne="http://schemas.microsoft.com/office/word/2006/wordml" xmlns:wps="http://schemas.microsoft.com/office/word/2010/wordprocessingShape" mc:Ignorable="w14 w15 w16se wp14">
   <w:abstractNum w:abstractNumId="0" w15:restartNumberingAfterBreak="0">
     <w:nsid w:val="0D4E0FDA"/>
     <w:multiLevelType w:val="multilevel"/>
@@ -6292,7 +6302,7 @@
 </file>
 
 <file path=word/styles.xml><?xml version="1.0" encoding="utf-8"?>
-<w:styles xmlns:mc="http://schemas.openxmlformats.org/markup-compatibility/2006" xmlns:r="http://schemas.openxmlformats.org/officeDocument/2006/relationships" xmlns:w="http://schemas.openxmlformats.org/wordprocessingml/2006/main" xmlns:w14="http://schemas.microsoft.com/office/word/2010/wordml" xmlns:w15="http://schemas.microsoft.com/office/word/2012/wordml" xmlns:w16cid="http://schemas.microsoft.com/office/word/2016/wordml/cid" xmlns:w16se="http://schemas.microsoft.com/office/word/2015/wordml/symex" mc:Ignorable="w14 w15 w16se w16cid">
+<w:styles xmlns:mc="http://schemas.openxmlformats.org/markup-compatibility/2006" xmlns:r="http://schemas.openxmlformats.org/officeDocument/2006/relationships" xmlns:w="http://schemas.openxmlformats.org/wordprocessingml/2006/main" xmlns:w14="http://schemas.microsoft.com/office/word/2010/wordml" xmlns:w15="http://schemas.microsoft.com/office/word/2012/wordml" xmlns:w16se="http://schemas.microsoft.com/office/word/2015/wordml/symex" mc:Ignorable="w14 w15 w16se">
   <w:docDefaults>
     <w:rPrDefault>
       <w:rPr>
@@ -6304,7 +6314,7 @@
     </w:rPrDefault>
     <w:pPrDefault/>
   </w:docDefaults>
-  <w:latentStyles w:defLockedState="0" w:defUIPriority="99" w:defSemiHidden="0" w:defUnhideWhenUsed="0" w:defQFormat="0" w:count="375">
+  <w:latentStyles w:defLockedState="0" w:defUIPriority="99" w:defSemiHidden="0" w:defUnhideWhenUsed="0" w:defQFormat="0" w:count="371">
     <w:lsdException w:name="Normal" w:uiPriority="0" w:qFormat="1"/>
     <w:lsdException w:name="heading 1" w:uiPriority="9" w:qFormat="1"/>
     <w:lsdException w:name="heading 2" w:semiHidden="1" w:uiPriority="9" w:unhideWhenUsed="1" w:qFormat="1"/>
@@ -6676,10 +6686,6 @@
     <w:lsdException w:name="List Table 5 Dark Accent 6" w:uiPriority="50"/>
     <w:lsdException w:name="List Table 6 Colorful Accent 6" w:uiPriority="51"/>
     <w:lsdException w:name="List Table 7 Colorful Accent 6" w:uiPriority="52"/>
-    <w:lsdException w:name="Mention" w:semiHidden="1" w:unhideWhenUsed="1"/>
-    <w:lsdException w:name="Smart Hyperlink" w:semiHidden="1" w:unhideWhenUsed="1"/>
-    <w:lsdException w:name="Hashtag" w:semiHidden="1" w:unhideWhenUsed="1"/>
-    <w:lsdException w:name="Unresolved Mention" w:semiHidden="1" w:unhideWhenUsed="1"/>
   </w:latentStyles>
   <w:style w:type="paragraph" w:default="1" w:styleId="Normal">
     <w:name w:val="Normal"/>

</xml_diff>